<commit_message>
Implement structural updates and optimizations across multiple modules
</commit_message>
<xml_diff>
--- a/Compiler_Project_Report.docx
+++ b/Compiler_Project_Report.docx
@@ -62,11 +62,6 @@
           <w:sz w:val="28"/>
         </w:rPr>
         <w:br/>
-      </w:r>
-      <w:r>
-        <w:rPr>
-          <w:sz w:val="28"/>
-        </w:rPr>
         <w:t>Muhammad Mahad</w:t>
       </w:r>
       <w:r>
@@ -125,12 +120,37 @@
       </w:r>
       <w:r>
         <w:rPr>
+          <w:b/>
+          <w:bCs/>
           <w:sz w:val="28"/>
         </w:rPr>
-        <w:t>Bashar (366006)</w:t>
+        <w:t xml:space="preserve">            </w:t>
+      </w:r>
+      <w:r>
+        <w:rPr>
+          <w:sz w:val="28"/>
+        </w:rPr>
+        <w:t xml:space="preserve">Muhammad </w:t>
+      </w:r>
+      <w:r>
+        <w:rPr>
+          <w:sz w:val="28"/>
+        </w:rPr>
+        <w:t>Bashar</w:t>
+      </w:r>
+      <w:r>
+        <w:rPr>
+          <w:sz w:val="28"/>
+        </w:rPr>
+        <w:t xml:space="preserve"> Siddiqui</w:t>
+      </w:r>
+      <w:r>
+        <w:rPr>
+          <w:sz w:val="28"/>
+        </w:rPr>
+        <w:t xml:space="preserve"> (366006)</w:t>
       </w:r>
     </w:p>
-    <w:p/>
     <w:p/>
     <w:p/>
     <w:p/>
@@ -797,14 +817,14 @@
         <w:pStyle w:val="Heading3"/>
       </w:pPr>
       <w:r>
-        <w:t>Output</w:t>
-      </w:r>
-      <w:r>
-        <w:t>:</w:t>
+        <w:t>Output:</w:t>
       </w:r>
     </w:p>
     <w:p>
       <w:r>
+        <w:rPr>
+          <w:noProof/>
+        </w:rPr>
         <w:drawing>
           <wp:inline distT="0" distB="0" distL="0" distR="0" wp14:anchorId="1AB0F34D" wp14:editId="3E3BE833">
             <wp:extent cx="5486400" cy="2024380"/>
@@ -2984,6 +3004,7 @@
   <w:style w:type="character" w:default="1" w:styleId="DefaultParagraphFont">
     <w:name w:val="Default Paragraph Font"/>
     <w:uiPriority w:val="1"/>
+    <w:semiHidden/>
     <w:unhideWhenUsed/>
   </w:style>
   <w:style w:type="table" w:default="1" w:styleId="TableNormal">

</xml_diff>